<commit_message>
Add the final merged report PDF and team details
Co-Authored-By: Claude Opus 5.5 <noreply@anthropic.com>
</commit_message>
<xml_diff>
--- a/final_project/reports/IDA117V_Contribution_Statement.docx
+++ b/final_project/reports/IDA117V_Contribution_Statement.docx
@@ -24,7 +24,7 @@
           <w:sz w:val="19"/>
           <w:szCs w:val="19"/>
         </w:rPr>
-        <w:t xml:space="preserve">Predicting Municipal Audit Outcomes · Group number: ______ · Lecturer: ____________________ · Submission date: ____________</w:t>
+        <w:t xml:space="preserve">Predicting Municipal Audit Outcomes · Group: Auditors · Lecturer: ____________________ · Submission date: ____________</w:t>
       </w:r>
     </w:p>
     <w:p>
@@ -280,7 +280,7 @@
                 <w:sz w:val="17"/>
                 <w:szCs w:val="17"/>
               </w:rPr>
-              <w:t xml:space="preserve">Thapelo ____________</w:t>
+              <w:t xml:space="preserve">T Chaba</w:t>
             </w:r>
           </w:p>
         </w:tc>
@@ -310,7 +310,7 @@
                 <w:sz w:val="17"/>
                 <w:szCs w:val="17"/>
               </w:rPr>
-              <w:t xml:space="preserve"/>
+              <w:t xml:space="preserve">216089898</w:t>
             </w:r>
           </w:p>
         </w:tc>
@@ -370,7 +370,7 @@
                 <w:sz w:val="17"/>
                 <w:szCs w:val="17"/>
               </w:rPr>
-              <w:t xml:space="preserve">Data acquisition from the Municipal Money API and modelling dataset (src/build_modeling_dataset.py); Q2 data audit, five EDA figures, time-based split and preprocessing pipeline (src/audit_q21_v2.py, visualize_q22_v2.py, split_q23_v2.py, pipeline_q24.py). Commits: “Question 2 done”, “dataset”.</w:t>
+              <w:t xml:space="preserve">Data acquisition from the Municipal Money API and modelling dataset (src/build_modeling_dataset.py); Question 2: data audit, five EDA figures, time-based split and preprocessing pipeline (src/audit_q21_v2.py, visualize_q22_v2.py, split_q23_v2.py, pipeline_q24.py) and the Question 2 report section. Commits: “Question 2 done”, “dataset”, “question 2 word doc”.</w:t>
             </w:r>
           </w:p>
         </w:tc>
@@ -465,7 +465,7 @@
                 <w:sz w:val="17"/>
                 <w:szCs w:val="17"/>
               </w:rPr>
-              <w:t xml:space="preserve">Pamela Khosa</w:t>
+              <w:t xml:space="preserve">P Khosa</w:t>
             </w:r>
           </w:p>
         </w:tc>
@@ -495,7 +495,7 @@
                 <w:sz w:val="17"/>
                 <w:szCs w:val="17"/>
               </w:rPr>
-              <w:t xml:space="preserve"/>
+              <w:t xml:space="preserve">221335970</w:t>
             </w:r>
           </w:p>
         </w:tc>
@@ -650,7 +650,7 @@
                 <w:sz w:val="17"/>
                 <w:szCs w:val="17"/>
               </w:rPr>
-              <w:t xml:space="preserve">Tendani Tshinavhe</w:t>
+              <w:t xml:space="preserve">T Tshinavhe</w:t>
             </w:r>
           </w:p>
         </w:tc>
@@ -680,7 +680,7 @@
                 <w:sz w:val="17"/>
                 <w:szCs w:val="17"/>
               </w:rPr>
-              <w:t xml:space="preserve"/>
+              <w:t xml:space="preserve">219537948</w:t>
             </w:r>
           </w:p>
         </w:tc>
@@ -740,7 +740,7 @@
                 <w:sz w:val="17"/>
                 <w:szCs w:val="17"/>
               </w:rPr>
-              <w:t xml:space="preserve">Q3 re-run on the time-based split (src/train_q3.py, neural.py, models.py); Q4 evaluation; Q5 optimisation and test; Q6 ablations and McNemar's test; Q7 dashboard (app/) and 2025 forecast (src/forecast_next.py); Q8 fairness and uncertainty analysis, reproducibility package (run_all.py, docs/) and report sections Q4–Q8.</w:t>
+              <w:t xml:space="preserve">Q3 re-run on the time-based split (src/train_q3.py, neural.py, models.py); Q4 evaluation; Q5 optimisation and test; Q6 ablations and McNemar's test; Q7 dashboard (app/) and 2025 forecast (src/forecast_next.py); Q8 fairness and uncertainty analysis, reproducibility package (run_all.py, docs/), merged report and presentations.</w:t>
             </w:r>
           </w:p>
         </w:tc>
@@ -835,7 +835,7 @@
                 <w:sz w:val="17"/>
                 <w:szCs w:val="17"/>
               </w:rPr>
-              <w:t xml:space="preserve"/>
+              <w:t xml:space="preserve">R Tabohane</w:t>
             </w:r>
           </w:p>
         </w:tc>
@@ -865,7 +865,7 @@
                 <w:sz w:val="17"/>
                 <w:szCs w:val="17"/>
               </w:rPr>
-              <w:t xml:space="preserve"/>
+              <w:t xml:space="preserve">217033101</w:t>
             </w:r>
           </w:p>
         </w:tc>
@@ -895,7 +895,7 @@
                 <w:sz w:val="17"/>
                 <w:szCs w:val="17"/>
               </w:rPr>
-              <w:t xml:space="preserve"/>
+              <w:t xml:space="preserve">[role]</w:t>
             </w:r>
           </w:p>
         </w:tc>
@@ -925,7 +925,7 @@
                 <w:sz w:val="17"/>
                 <w:szCs w:val="17"/>
               </w:rPr>
-              <w:t xml:space="preserve">Concept note, dataset card and feasibility check (Question 1): ______________________</w:t>
+              <w:t xml:space="preserve">[Specific outputs. Question 1 was committed by GitHub user Tran203: confirm whose account this is.]</w:t>
             </w:r>
           </w:p>
         </w:tc>
@@ -1020,7 +1020,7 @@
                 <w:sz w:val="17"/>
                 <w:szCs w:val="17"/>
               </w:rPr>
-              <w:t xml:space="preserve"/>
+              <w:t xml:space="preserve">T Mabena</w:t>
             </w:r>
           </w:p>
         </w:tc>
@@ -1050,7 +1050,7 @@
                 <w:sz w:val="17"/>
                 <w:szCs w:val="17"/>
               </w:rPr>
-              <w:t xml:space="preserve"/>
+              <w:t xml:space="preserve">221641221</w:t>
             </w:r>
           </w:p>
         </w:tc>
@@ -1080,7 +1080,7 @@
                 <w:sz w:val="17"/>
                 <w:szCs w:val="17"/>
               </w:rPr>
-              <w:t xml:space="preserve"/>
+              <w:t xml:space="preserve">[role]</w:t>
             </w:r>
           </w:p>
         </w:tc>
@@ -1110,192 +1110,7 @@
                 <w:sz w:val="17"/>
                 <w:szCs w:val="17"/>
               </w:rPr>
-              <w:t xml:space="preserve"/>
-            </w:r>
-          </w:p>
-        </w:tc>
-        <w:tc>
-          <w:tcPr>
-            <w:tcW w:type="dxa" w:w="2000"/>
-            <w:tcBorders>
-              <w:top w:val="single" w:color="8A93A6" w:sz="4"/>
-              <w:left w:val="single" w:color="8A93A6" w:sz="4"/>
-              <w:bottom w:val="single" w:color="8A93A6" w:sz="4"/>
-              <w:right w:val="single" w:color="8A93A6" w:sz="4"/>
-            </w:tcBorders>
-            <w:tcMar>
-              <w:top w:type="dxa" w:w="50"/>
-              <w:left w:type="dxa" w:w="80"/>
-              <w:bottom w:type="dxa" w:w="50"/>
-              <w:right w:type="dxa" w:w="80"/>
-            </w:tcMar>
-          </w:tcPr>
-          <w:p>
-            <w:r>
-              <w:rPr>
-                <w:rFonts w:ascii="Calibri" w:cs="Calibri" w:eastAsia="Calibri" w:hAnsi="Calibri"/>
-                <w:b w:val="false"/>
-                <w:bCs w:val="false"/>
-                <w:color w:val="000000"/>
-                <w:sz w:val="17"/>
-                <w:szCs w:val="17"/>
-              </w:rPr>
-              <w:t xml:space="preserve"/>
-            </w:r>
-          </w:p>
-        </w:tc>
-        <w:tc>
-          <w:tcPr>
-            <w:tcW w:type="dxa" w:w="1200"/>
-            <w:tcBorders>
-              <w:top w:val="single" w:color="8A93A6" w:sz="4"/>
-              <w:left w:val="single" w:color="8A93A6" w:sz="4"/>
-              <w:bottom w:val="single" w:color="8A93A6" w:sz="4"/>
-              <w:right w:val="single" w:color="8A93A6" w:sz="4"/>
-            </w:tcBorders>
-            <w:tcMar>
-              <w:top w:type="dxa" w:w="50"/>
-              <w:left w:type="dxa" w:w="80"/>
-              <w:bottom w:type="dxa" w:w="50"/>
-              <w:right w:type="dxa" w:w="80"/>
-            </w:tcMar>
-          </w:tcPr>
-          <w:p>
-            <w:r>
-              <w:rPr>
-                <w:rFonts w:ascii="Calibri" w:cs="Calibri" w:eastAsia="Calibri" w:hAnsi="Calibri"/>
-                <w:b w:val="false"/>
-                <w:bCs w:val="false"/>
-                <w:color w:val="000000"/>
-                <w:sz w:val="17"/>
-                <w:szCs w:val="17"/>
-              </w:rPr>
-              <w:t xml:space="preserve"/>
-            </w:r>
-          </w:p>
-        </w:tc>
-      </w:tr>
-      <w:tr>
-        <w:trPr>
-          <w:trHeight w:val="640" w:hRule="atLeast"/>
-        </w:trPr>
-        <w:tc>
-          <w:tcPr>
-            <w:tcW w:type="dxa" w:w="2300"/>
-            <w:tcBorders>
-              <w:top w:val="single" w:color="8A93A6" w:sz="4"/>
-              <w:left w:val="single" w:color="8A93A6" w:sz="4"/>
-              <w:bottom w:val="single" w:color="8A93A6" w:sz="4"/>
-              <w:right w:val="single" w:color="8A93A6" w:sz="4"/>
-            </w:tcBorders>
-            <w:tcMar>
-              <w:top w:type="dxa" w:w="50"/>
-              <w:left w:type="dxa" w:w="80"/>
-              <w:bottom w:type="dxa" w:w="50"/>
-              <w:right w:type="dxa" w:w="80"/>
-            </w:tcMar>
-          </w:tcPr>
-          <w:p>
-            <w:r>
-              <w:rPr>
-                <w:rFonts w:ascii="Calibri" w:cs="Calibri" w:eastAsia="Calibri" w:hAnsi="Calibri"/>
-                <w:b w:val="false"/>
-                <w:bCs w:val="false"/>
-                <w:color w:val="000000"/>
-                <w:sz w:val="17"/>
-                <w:szCs w:val="17"/>
-              </w:rPr>
-              <w:t xml:space="preserve"/>
-            </w:r>
-          </w:p>
-        </w:tc>
-        <w:tc>
-          <w:tcPr>
-            <w:tcW w:type="dxa" w:w="1500"/>
-            <w:tcBorders>
-              <w:top w:val="single" w:color="8A93A6" w:sz="4"/>
-              <w:left w:val="single" w:color="8A93A6" w:sz="4"/>
-              <w:bottom w:val="single" w:color="8A93A6" w:sz="4"/>
-              <w:right w:val="single" w:color="8A93A6" w:sz="4"/>
-            </w:tcBorders>
-            <w:tcMar>
-              <w:top w:type="dxa" w:w="50"/>
-              <w:left w:type="dxa" w:w="80"/>
-              <w:bottom w:type="dxa" w:w="50"/>
-              <w:right w:type="dxa" w:w="80"/>
-            </w:tcMar>
-          </w:tcPr>
-          <w:p>
-            <w:r>
-              <w:rPr>
-                <w:rFonts w:ascii="Calibri" w:cs="Calibri" w:eastAsia="Calibri" w:hAnsi="Calibri"/>
-                <w:b w:val="false"/>
-                <w:bCs w:val="false"/>
-                <w:color w:val="000000"/>
-                <w:sz w:val="17"/>
-                <w:szCs w:val="17"/>
-              </w:rPr>
-              <w:t xml:space="preserve"/>
-            </w:r>
-          </w:p>
-        </w:tc>
-        <w:tc>
-          <w:tcPr>
-            <w:tcW w:type="dxa" w:w="2300"/>
-            <w:tcBorders>
-              <w:top w:val="single" w:color="8A93A6" w:sz="4"/>
-              <w:left w:val="single" w:color="8A93A6" w:sz="4"/>
-              <w:bottom w:val="single" w:color="8A93A6" w:sz="4"/>
-              <w:right w:val="single" w:color="8A93A6" w:sz="4"/>
-            </w:tcBorders>
-            <w:tcMar>
-              <w:top w:type="dxa" w:w="50"/>
-              <w:left w:type="dxa" w:w="80"/>
-              <w:bottom w:type="dxa" w:w="50"/>
-              <w:right w:type="dxa" w:w="80"/>
-            </w:tcMar>
-          </w:tcPr>
-          <w:p>
-            <w:r>
-              <w:rPr>
-                <w:rFonts w:ascii="Calibri" w:cs="Calibri" w:eastAsia="Calibri" w:hAnsi="Calibri"/>
-                <w:b w:val="false"/>
-                <w:bCs w:val="false"/>
-                <w:color w:val="000000"/>
-                <w:sz w:val="17"/>
-                <w:szCs w:val="17"/>
-              </w:rPr>
-              <w:t xml:space="preserve"/>
-            </w:r>
-          </w:p>
-        </w:tc>
-        <w:tc>
-          <w:tcPr>
-            <w:tcW w:type="dxa" w:w="5000"/>
-            <w:tcBorders>
-              <w:top w:val="single" w:color="8A93A6" w:sz="4"/>
-              <w:left w:val="single" w:color="8A93A6" w:sz="4"/>
-              <w:bottom w:val="single" w:color="8A93A6" w:sz="4"/>
-              <w:right w:val="single" w:color="8A93A6" w:sz="4"/>
-            </w:tcBorders>
-            <w:tcMar>
-              <w:top w:type="dxa" w:w="50"/>
-              <w:left w:type="dxa" w:w="80"/>
-              <w:bottom w:type="dxa" w:w="50"/>
-              <w:right w:type="dxa" w:w="80"/>
-            </w:tcMar>
-          </w:tcPr>
-          <w:p>
-            <w:r>
-              <w:rPr>
-                <w:rFonts w:ascii="Calibri" w:cs="Calibri" w:eastAsia="Calibri" w:hAnsi="Calibri"/>
-                <w:b w:val="false"/>
-                <w:bCs w:val="false"/>
-                <w:color w:val="000000"/>
-                <w:sz w:val="17"/>
-                <w:szCs w:val="17"/>
-              </w:rPr>
-              <w:t xml:space="preserve"/>
+              <w:t xml:space="preserve">[Specific outputs]</w:t>
             </w:r>
           </w:p>
         </w:tc>

</xml_diff>

<commit_message>
Add per-question notebooks, update Baseline&Models.ipynb, final report
- final_project/notebooks/01-07: one executed notebook per report question (Q1-Q8)
- Baseline&Models.ipynb updated to the corrected Q3 (time-based split); original kept in final_project/notebooks/archive
- report: lecturer, submission date, recaptured dashboard screenshots, Figure A.13 (24 pages)
- contribution statement, README notes on the notebooks

Co-Authored-By: Claude Opus 5.5 <noreply@anthropic.com>
</commit_message>
<xml_diff>
--- a/final_project/reports/IDA117V_Contribution_Statement.docx
+++ b/final_project/reports/IDA117V_Contribution_Statement.docx
@@ -24,7 +24,7 @@
           <w:sz w:val="19"/>
           <w:szCs w:val="19"/>
         </w:rPr>
-        <w:t xml:space="preserve">Predicting Municipal Audit Outcomes · Group: Auditors · Lecturer: ____________________ · Submission date: ____________</w:t>
+        <w:t xml:space="preserve">Predicting Municipal Audit Outcomes · Group: Auditors · Lecturer: Dr Dan Masethe · Submission date: 20/10/2026</w:t>
       </w:r>
     </w:p>
     <w:p>
@@ -1194,7 +1194,7 @@
           <w:sz w:val="18"/>
           <w:szCs w:val="18"/>
         </w:rPr>
-        <w:t xml:space="preserve">AI assistance: an AI coding assistant (Claude, by Anthropic) was used to help write and debug code and draft parts of the Question 4–8 text; commits made with its help are labelled in the repository. The team reviewed and verified all of it.</w:t>
+        <w:t xml:space="preserve">AI assistance: AI tools (Claude, by Anthropic) were used to assist with research, coding and drafting; the team reviewed and verified all of it.</w:t>
       </w:r>
     </w:p>
     <w:sectPr>

</xml_diff>

<commit_message>
Update team roles in README, contribution statement and report 8.3
Co-Authored-By: Claude Opus 5.5 <noreply@anthropic.com>
</commit_message>
<xml_diff>
--- a/final_project/reports/IDA117V_Contribution_Statement.docx
+++ b/final_project/reports/IDA117V_Contribution_Statement.docx
@@ -36,7 +36,7 @@
           <w:sz w:val="18"/>
           <w:szCs w:val="18"/>
         </w:rPr>
-        <w:t xml:space="preserve">Each member's role and specific outputs are listed below. Pre-filled entries come from the repository's commit history; members must confirm or correct them before signing.</w:t>
+        <w:t xml:space="preserve">Each member's role and specific outputs, as agreed by the team, are listed below. Each member confirms their entry by signing.</w:t>
       </w:r>
     </w:p>
     <w:tbl>
@@ -340,7 +340,7 @@
                 <w:sz w:val="17"/>
                 <w:szCs w:val="17"/>
               </w:rPr>
-              <w:t xml:space="preserve">Data governance and preparation lead</w:t>
+              <w:t xml:space="preserve">Data governance and preparation (Question 2)</w:t>
             </w:r>
           </w:p>
         </w:tc>
@@ -370,7 +370,7 @@
                 <w:sz w:val="17"/>
                 <w:szCs w:val="17"/>
               </w:rPr>
-              <w:t xml:space="preserve">Data acquisition from the Municipal Money API and modelling dataset (src/build_modeling_dataset.py); Question 2: data audit, five EDA figures, time-based split and preprocessing pipeline (src/audit_q21_v2.py, visualize_q22_v2.py, split_q23_v2.py, pipeline_q24.py) and the Question 2 report section. Commits: “Question 2 done”, “dataset”, “question 2 word doc”.</w:t>
+              <w:t xml:space="preserve">Data acquisition from the Municipal Money API and modelling dataset (src/build_modeling_dataset.py); Question 2: data audit, five EDA figures, time-based split and preprocessing pipeline (src/audit_q21_v2.py, visualize_q22_v2.py, split_q23_v2.py, pipeline_q24.py) and the Question 2 report section.</w:t>
             </w:r>
           </w:p>
         </w:tc>
@@ -465,7 +465,7 @@
                 <w:sz w:val="17"/>
                 <w:szCs w:val="17"/>
               </w:rPr>
-              <w:t xml:space="preserve">P Khosa</w:t>
+              <w:t xml:space="preserve">R Tabohane</w:t>
             </w:r>
           </w:p>
         </w:tc>
@@ -495,7 +495,7 @@
                 <w:sz w:val="17"/>
                 <w:szCs w:val="17"/>
               </w:rPr>
-              <w:t xml:space="preserve">221335970</w:t>
+              <w:t xml:space="preserve">217033101</w:t>
             </w:r>
           </w:p>
         </w:tc>
@@ -525,7 +525,7 @@
                 <w:sz w:val="17"/>
                 <w:szCs w:val="17"/>
               </w:rPr>
-              <w:t xml:space="preserve">Modelling lead (first Question 3 run)</w:t>
+              <w:t xml:space="preserve">Optimisation, ablation and statistical testing (Questions 5–6)</w:t>
             </w:r>
           </w:p>
         </w:tc>
@@ -555,7 +555,7 @@
                 <w:sz w:val="17"/>
                 <w:szCs w:val="17"/>
               </w:rPr>
-              <w:t xml:space="preserve">First baseline and four-model notebook and Question 3 write-up (notebooks/archive). Commit: “Add files via upload”.</w:t>
+              <w:t xml:space="preserve">Question 5: Optuna optimisation of the champion and the one-time test on the 2023 year (src/optimise_q5.py); Question 6: ablation study and McNemar's test (src/ablation_mcnemar_q6.py) and the Questions 5–6 report sections.</w:t>
             </w:r>
           </w:p>
         </w:tc>
@@ -650,7 +650,7 @@
                 <w:sz w:val="17"/>
                 <w:szCs w:val="17"/>
               </w:rPr>
-              <w:t xml:space="preserve">T Tshinavhe</w:t>
+              <w:t xml:space="preserve">T Mabena</w:t>
             </w:r>
           </w:p>
         </w:tc>
@@ -680,7 +680,7 @@
                 <w:sz w:val="17"/>
                 <w:szCs w:val="17"/>
               </w:rPr>
-              <w:t xml:space="preserve">219537948</w:t>
+              <w:t xml:space="preserve">221641221</w:t>
             </w:r>
           </w:p>
         </w:tc>
@@ -710,7 +710,7 @@
                 <w:sz w:val="17"/>
                 <w:szCs w:val="17"/>
               </w:rPr>
-              <w:t xml:space="preserve">Evaluation, deployment and reproducibility lead</w:t>
+              <w:t xml:space="preserve">Problem definition and evaluation (Questions 1 and 4)</w:t>
             </w:r>
           </w:p>
         </w:tc>
@@ -740,7 +740,7 @@
                 <w:sz w:val="17"/>
                 <w:szCs w:val="17"/>
               </w:rPr>
-              <w:t xml:space="preserve">Q3 re-run on the time-based split (src/train_q3.py, neural.py, models.py); Q4 evaluation; Q5 optimisation and test; Q6 ablations and McNemar's test; Q7 dashboard (app/) and 2025 forecast (src/forecast_next.py); Q8 fairness and uncertainty analysis, reproducibility package (run_all.py, docs/), merged report and presentations.</w:t>
+              <w:t xml:space="preserve">Question 1: problem, stakeholder, decision and success criteria; Question 4: evaluation metrics, ROC/PR curves, walk-forward cross-validation and overfitting analysis (src/evaluate_q4.py) and the Questions 1 and 4 report sections.</w:t>
             </w:r>
           </w:p>
         </w:tc>
@@ -835,7 +835,7 @@
                 <w:sz w:val="17"/>
                 <w:szCs w:val="17"/>
               </w:rPr>
-              <w:t xml:space="preserve">R Tabohane</w:t>
+              <w:t xml:space="preserve">T Tshinavhe</w:t>
             </w:r>
           </w:p>
         </w:tc>
@@ -865,7 +865,7 @@
                 <w:sz w:val="17"/>
                 <w:szCs w:val="17"/>
               </w:rPr>
-              <w:t xml:space="preserve">217033101</w:t>
+              <w:t xml:space="preserve">219537948</w:t>
             </w:r>
           </w:p>
         </w:tc>
@@ -895,7 +895,7 @@
                 <w:sz w:val="17"/>
                 <w:szCs w:val="17"/>
               </w:rPr>
-              <w:t xml:space="preserve">[role]</w:t>
+              <w:t xml:space="preserve">Deployment, uncertainty and recommendation (Questions 7–8)</w:t>
             </w:r>
           </w:p>
         </w:tc>
@@ -925,7 +925,7 @@
                 <w:sz w:val="17"/>
                 <w:szCs w:val="17"/>
               </w:rPr>
-              <w:t xml:space="preserve">[Specific outputs. Question 1 was committed by GitHub user Tran203: confirm whose account this is.]</w:t>
+              <w:t xml:space="preserve">Question 7: Streamlit dashboard (app/) and 2025 forecast (src/forecast_next.py); Question 8: bootstrap uncertainty, calibration, fairness, recommendation and reproducibility package (run_all.py, docs/); merged report and presentations.</w:t>
             </w:r>
           </w:p>
         </w:tc>
@@ -1020,7 +1020,7 @@
                 <w:sz w:val="17"/>
                 <w:szCs w:val="17"/>
               </w:rPr>
-              <w:t xml:space="preserve">T Mabena</w:t>
+              <w:t xml:space="preserve">P Khosa</w:t>
             </w:r>
           </w:p>
         </w:tc>
@@ -1050,7 +1050,7 @@
                 <w:sz w:val="17"/>
                 <w:szCs w:val="17"/>
               </w:rPr>
-              <w:t xml:space="preserve">221641221</w:t>
+              <w:t xml:space="preserve">221335970</w:t>
             </w:r>
           </w:p>
         </w:tc>
@@ -1080,7 +1080,7 @@
                 <w:sz w:val="17"/>
                 <w:szCs w:val="17"/>
               </w:rPr>
-              <w:t xml:space="preserve">[role]</w:t>
+              <w:t xml:space="preserve">Modelling (first Question 3 run)</w:t>
             </w:r>
           </w:p>
         </w:tc>
@@ -1110,7 +1110,7 @@
                 <w:sz w:val="17"/>
                 <w:szCs w:val="17"/>
               </w:rPr>
-              <w:t xml:space="preserve">[Specific outputs]</w:t>
+              <w:t xml:space="preserve">First baseline and four-model notebook and Question 3 write-up (Baseline&amp;Models.ipynb, notebooks/archive).</w:t>
             </w:r>
           </w:p>
         </w:tc>

</xml_diff>

<commit_message>
Add initials and date to the contribution statement
Co-Authored-By: Claude Opus 5.5 <noreply@anthropic.com>
</commit_message>
<xml_diff>
--- a/final_project/reports/IDA117V_Contribution_Statement.docx
+++ b/final_project/reports/IDA117V_Contribution_Statement.docx
@@ -400,7 +400,7 @@
                 <w:sz w:val="17"/>
                 <w:szCs w:val="17"/>
               </w:rPr>
-              <w:t xml:space="preserve"/>
+              <w:t xml:space="preserve">TC</w:t>
             </w:r>
           </w:p>
         </w:tc>
@@ -430,7 +430,7 @@
                 <w:sz w:val="17"/>
                 <w:szCs w:val="17"/>
               </w:rPr>
-              <w:t xml:space="preserve"/>
+              <w:t xml:space="preserve">20/10/2026</w:t>
             </w:r>
           </w:p>
         </w:tc>
@@ -585,7 +585,7 @@
                 <w:sz w:val="17"/>
                 <w:szCs w:val="17"/>
               </w:rPr>
-              <w:t xml:space="preserve"/>
+              <w:t xml:space="preserve">RT</w:t>
             </w:r>
           </w:p>
         </w:tc>
@@ -615,7 +615,7 @@
                 <w:sz w:val="17"/>
                 <w:szCs w:val="17"/>
               </w:rPr>
-              <w:t xml:space="preserve"/>
+              <w:t xml:space="preserve">20/10/2026</w:t>
             </w:r>
           </w:p>
         </w:tc>
@@ -770,7 +770,7 @@
                 <w:sz w:val="17"/>
                 <w:szCs w:val="17"/>
               </w:rPr>
-              <w:t xml:space="preserve"/>
+              <w:t xml:space="preserve">TM</w:t>
             </w:r>
           </w:p>
         </w:tc>
@@ -800,7 +800,7 @@
                 <w:sz w:val="17"/>
                 <w:szCs w:val="17"/>
               </w:rPr>
-              <w:t xml:space="preserve"/>
+              <w:t xml:space="preserve">20/10/2026</w:t>
             </w:r>
           </w:p>
         </w:tc>
@@ -955,7 +955,7 @@
                 <w:sz w:val="17"/>
                 <w:szCs w:val="17"/>
               </w:rPr>
-              <w:t xml:space="preserve"/>
+              <w:t xml:space="preserve">TT</w:t>
             </w:r>
           </w:p>
         </w:tc>
@@ -985,7 +985,7 @@
                 <w:sz w:val="17"/>
                 <w:szCs w:val="17"/>
               </w:rPr>
-              <w:t xml:space="preserve"/>
+              <w:t xml:space="preserve">20/10/2026</w:t>
             </w:r>
           </w:p>
         </w:tc>
@@ -1140,7 +1140,7 @@
                 <w:sz w:val="17"/>
                 <w:szCs w:val="17"/>
               </w:rPr>
-              <w:t xml:space="preserve"/>
+              <w:t xml:space="preserve">PK</w:t>
             </w:r>
           </w:p>
         </w:tc>
@@ -1170,7 +1170,7 @@
                 <w:sz w:val="17"/>
                 <w:szCs w:val="17"/>
               </w:rPr>
-              <w:t xml:space="preserve"/>
+              <w:t xml:space="preserve">20/10/2026</w:t>
             </w:r>
           </w:p>
         </w:tc>

</xml_diff>

<commit_message>
Use first initial as signature in the contribution statement
Co-Authored-By: Claude Opus 5.5 <noreply@anthropic.com>
</commit_message>
<xml_diff>
--- a/final_project/reports/IDA117V_Contribution_Statement.docx
+++ b/final_project/reports/IDA117V_Contribution_Statement.docx
@@ -400,7 +400,7 @@
                 <w:sz w:val="17"/>
                 <w:szCs w:val="17"/>
               </w:rPr>
-              <w:t xml:space="preserve">TC</w:t>
+              <w:t xml:space="preserve">T</w:t>
             </w:r>
           </w:p>
         </w:tc>
@@ -585,7 +585,7 @@
                 <w:sz w:val="17"/>
                 <w:szCs w:val="17"/>
               </w:rPr>
-              <w:t xml:space="preserve">RT</w:t>
+              <w:t xml:space="preserve">R</w:t>
             </w:r>
           </w:p>
         </w:tc>
@@ -770,7 +770,7 @@
                 <w:sz w:val="17"/>
                 <w:szCs w:val="17"/>
               </w:rPr>
-              <w:t xml:space="preserve">TM</w:t>
+              <w:t xml:space="preserve">T</w:t>
             </w:r>
           </w:p>
         </w:tc>
@@ -955,7 +955,7 @@
                 <w:sz w:val="17"/>
                 <w:szCs w:val="17"/>
               </w:rPr>
-              <w:t xml:space="preserve">TT</w:t>
+              <w:t xml:space="preserve">T</w:t>
             </w:r>
           </w:p>
         </w:tc>
@@ -1140,7 +1140,7 @@
                 <w:sz w:val="17"/>
                 <w:szCs w:val="17"/>
               </w:rPr>
-              <w:t xml:space="preserve">PK</w:t>
+              <w:t xml:space="preserve">P</w:t>
             </w:r>
           </w:p>
         </w:tc>

</xml_diff>